<commit_message>
added reset password functional
</commit_message>
<xml_diff>
--- a/Documentation/PlantPAl.docx
+++ b/Documentation/PlantPAl.docx
@@ -5921,7 +5921,7 @@
           <w:szCs w:val="24"/>
         </w:rPr>
         <w:pict w14:anchorId="33A4D6A8">
-          <v:rect id="_x0000_i1063" style="width:0;height:1.5pt" o:hralign="center" o:hrstd="t" o:hr="t" fillcolor="#a0a0a0" stroked="f"/>
+          <v:rect id="_x0000_i1025" style="width:0;height:1.5pt" o:hralign="center" o:hrstd="t" o:hr="t" fillcolor="#a0a0a0" stroked="f"/>
         </w:pict>
       </w:r>
     </w:p>
@@ -6230,7 +6230,7 @@
           <w:szCs w:val="24"/>
         </w:rPr>
         <w:pict w14:anchorId="55CBBD60">
-          <v:rect id="_x0000_i1064" style="width:0;height:1.5pt" o:hralign="center" o:hrstd="t" o:hr="t" fillcolor="#a0a0a0" stroked="f"/>
+          <v:rect id="_x0000_i1026" style="width:0;height:1.5pt" o:hralign="center" o:hrstd="t" o:hr="t" fillcolor="#a0a0a0" stroked="f"/>
         </w:pict>
       </w:r>
     </w:p>
@@ -6598,7 +6598,7 @@
           <w:szCs w:val="24"/>
         </w:rPr>
         <w:pict w14:anchorId="042CFD9F">
-          <v:rect id="_x0000_i1065" style="width:0;height:1.5pt" o:hralign="center" o:hrstd="t" o:hr="t" fillcolor="#a0a0a0" stroked="f"/>
+          <v:rect id="_x0000_i1027" style="width:0;height:1.5pt" o:hralign="center" o:hrstd="t" o:hr="t" fillcolor="#a0a0a0" stroked="f"/>
         </w:pict>
       </w:r>
     </w:p>
@@ -7672,7 +7672,7 @@
           <w:szCs w:val="24"/>
         </w:rPr>
         <w:pict w14:anchorId="1499C13E">
-          <v:rect id="_x0000_i1085" style="width:0;height:1.5pt" o:hralign="center" o:hrstd="t" o:hr="t" fillcolor="#a0a0a0" stroked="f"/>
+          <v:rect id="_x0000_i1028" style="width:0;height:1.5pt" o:hralign="center" o:hrstd="t" o:hr="t" fillcolor="#a0a0a0" stroked="f"/>
         </w:pict>
       </w:r>
     </w:p>
@@ -8306,7 +8306,7 @@
           <w:szCs w:val="24"/>
         </w:rPr>
         <w:pict w14:anchorId="69971933">
-          <v:rect id="_x0000_i1086" style="width:0;height:1.5pt" o:hralign="center" o:hrstd="t" o:hr="t" fillcolor="#a0a0a0" stroked="f"/>
+          <v:rect id="_x0000_i1029" style="width:0;height:1.5pt" o:hralign="center" o:hrstd="t" o:hr="t" fillcolor="#a0a0a0" stroked="f"/>
         </w:pict>
       </w:r>
     </w:p>
@@ -9036,7 +9036,7 @@
           <w:szCs w:val="24"/>
         </w:rPr>
         <w:pict w14:anchorId="64AEA3C6">
-          <v:rect id="_x0000_i1087" style="width:0;height:1.5pt" o:hralign="center" o:hrstd="t" o:hr="t" fillcolor="#a0a0a0" stroked="f"/>
+          <v:rect id="_x0000_i1030" style="width:0;height:1.5pt" o:hralign="center" o:hrstd="t" o:hr="t" fillcolor="#a0a0a0" stroked="f"/>
         </w:pict>
       </w:r>
     </w:p>
@@ -9916,7 +9916,7 @@
           <w:szCs w:val="24"/>
         </w:rPr>
         <w:pict w14:anchorId="1ACDD280">
-          <v:rect id="_x0000_i1088" style="width:0;height:1.5pt" o:hralign="center" o:hrstd="t" o:hr="t" fillcolor="#a0a0a0" stroked="f"/>
+          <v:rect id="_x0000_i1031" style="width:0;height:1.5pt" o:hralign="center" o:hrstd="t" o:hr="t" fillcolor="#a0a0a0" stroked="f"/>
         </w:pict>
       </w:r>
     </w:p>
@@ -10663,7 +10663,7 @@
           <w:szCs w:val="24"/>
         </w:rPr>
         <w:pict w14:anchorId="65113DBB">
-          <v:rect id="_x0000_i1089" style="width:0;height:1.5pt" o:hralign="center" o:hrstd="t" o:hr="t" fillcolor="#a0a0a0" stroked="f"/>
+          <v:rect id="_x0000_i1032" style="width:0;height:1.5pt" o:hralign="center" o:hrstd="t" o:hr="t" fillcolor="#a0a0a0" stroked="f"/>
         </w:pict>
       </w:r>
     </w:p>
@@ -12974,7 +12974,7 @@
     <w:p>
       <w:r>
         <w:pict w14:anchorId="78E13D23">
-          <v:rect id="_x0000_i1140" style="width:0;height:1.5pt" o:hralign="center" o:hrstd="t" o:hr="t" fillcolor="#a0a0a0" stroked="f"/>
+          <v:rect id="_x0000_i1033" style="width:0;height:1.5pt" o:hralign="center" o:hrstd="t" o:hr="t" fillcolor="#a0a0a0" stroked="f"/>
         </w:pict>
       </w:r>
     </w:p>
@@ -13531,6 +13531,7 @@
         <w:rPr>
           <w:rFonts w:ascii="Sylfaen" w:hAnsi="Sylfaen" w:cs="Sylfaen"/>
         </w:rPr>
+        <w:lastRenderedPageBreak/>
         <w:t>ხოლო</w:t>
       </w:r>
       <w:r>
@@ -13723,114 +13724,150 @@
       </w:r>
     </w:p>
     <w:p>
-      <w:r>
-        <w:pict w14:anchorId="73F36D7F">
-          <v:rect id="_x0000_i1141" style="width:0;height:1.5pt" o:hralign="center" o:hrstd="t" o:hr="t" fillcolor="#a0a0a0" stroked="f"/>
-        </w:pict>
+      <w:pPr>
+        <w:pStyle w:val="Heading2"/>
+        <w:rPr>
+          <w:lang w:val="ka-GE"/>
+        </w:rPr>
+      </w:pPr>
+      <w:r>
+        <w:t>5.</w:t>
+      </w:r>
+      <w:r>
+        <w:t>4</w:t>
+      </w:r>
+      <w:r>
+        <w:t xml:space="preserve"> </w:t>
+      </w:r>
+      <w:r>
+        <w:rPr>
+          <w:lang w:val="ka-GE"/>
+        </w:rPr>
+        <w:t>მომხმარებლის ინტერფეისის სურათები</w:t>
       </w:r>
     </w:p>
     <w:p>
       <w:pPr>
-        <w:pStyle w:val="Heading2"/>
-      </w:pPr>
-      <w:r>
-        <w:t xml:space="preserve">5.3 </w:t>
-      </w:r>
-      <w:r>
-        <w:t>მნიშვნელოვანი</w:t>
-      </w:r>
-      <w:r>
-        <w:t xml:space="preserve"> </w:t>
-      </w:r>
-      <w:r>
-        <w:t>ტექნიკური</w:t>
-      </w:r>
-      <w:r>
-        <w:t xml:space="preserve"> </w:t>
-      </w:r>
-      <w:r>
-        <w:t>გადაწყვეტილებები</w:t>
-      </w:r>
+        <w:pStyle w:val="NormalWeb"/>
+      </w:pPr>
     </w:p>
     <w:p>
-      <w:pPr>
-        <w:pStyle w:val="NormalWeb"/>
-      </w:pPr>
-      <w:r>
-        <w:rPr>
-          <w:rFonts w:ascii="Sylfaen" w:hAnsi="Sylfaen" w:cs="Sylfaen"/>
-        </w:rPr>
-        <w:t>პროექტის</w:t>
-      </w:r>
-      <w:r>
-        <w:t xml:space="preserve"> </w:t>
-      </w:r>
-      <w:r>
-        <w:rPr>
-          <w:rFonts w:ascii="Sylfaen" w:hAnsi="Sylfaen" w:cs="Sylfaen"/>
-        </w:rPr>
-        <w:t>განვითარებისას</w:t>
-      </w:r>
-      <w:r>
-        <w:t xml:space="preserve"> </w:t>
-      </w:r>
-      <w:r>
-        <w:rPr>
-          <w:rFonts w:ascii="Sylfaen" w:hAnsi="Sylfaen" w:cs="Sylfaen"/>
-        </w:rPr>
-        <w:t>მიღებული</w:t>
-      </w:r>
-      <w:r>
-        <w:t xml:space="preserve"> </w:t>
-      </w:r>
-      <w:r>
-        <w:rPr>
-          <w:rFonts w:ascii="Sylfaen" w:hAnsi="Sylfaen" w:cs="Sylfaen"/>
-        </w:rPr>
-        <w:t>იქნა</w:t>
-      </w:r>
-      <w:r>
-        <w:t xml:space="preserve"> </w:t>
-      </w:r>
-      <w:r>
-        <w:rPr>
-          <w:rFonts w:ascii="Sylfaen" w:hAnsi="Sylfaen" w:cs="Sylfaen"/>
-        </w:rPr>
-        <w:t>რამდენიმე</w:t>
-      </w:r>
-      <w:r>
-        <w:t xml:space="preserve"> </w:t>
-      </w:r>
-      <w:r>
-        <w:rPr>
-          <w:rFonts w:ascii="Sylfaen" w:hAnsi="Sylfaen" w:cs="Sylfaen"/>
-        </w:rPr>
-        <w:t>მნიშვნელოვანი</w:t>
-      </w:r>
-      <w:r>
-        <w:t xml:space="preserve"> </w:t>
-      </w:r>
-      <w:r>
-        <w:rPr>
-          <w:rFonts w:ascii="Sylfaen" w:hAnsi="Sylfaen" w:cs="Sylfaen"/>
-        </w:rPr>
-        <w:t>ტექნიკური</w:t>
-      </w:r>
-      <w:r>
-        <w:t xml:space="preserve"> </w:t>
-      </w:r>
-      <w:r>
-        <w:rPr>
-          <w:rFonts w:ascii="Sylfaen" w:hAnsi="Sylfaen" w:cs="Sylfaen"/>
-        </w:rPr>
-        <w:t>გადაწყვეტილება</w:t>
-      </w:r>
-      <w:r>
-        <w:t>.</w:t>
+      <w:r>
+        <w:pict w14:anchorId="73F36D7F">
+          <v:rect id="_x0000_i1034" style="width:0;height:1.5pt" o:hralign="center" o:hrstd="t" o:hr="t" fillcolor="#a0a0a0" stroked="f"/>
+        </w:pict>
       </w:r>
     </w:p>
     <w:p>
       <w:pPr>
+        <w:pStyle w:val="Heading2"/>
+      </w:pPr>
+      <w:bookmarkStart w:id="0" w:name="_Hlk236212432"/>
+      <w:r>
+        <w:t>5.</w:t>
+      </w:r>
+      <w:r>
+        <w:t>5</w:t>
+      </w:r>
+      <w:r>
+        <w:t xml:space="preserve"> </w:t>
+      </w:r>
+      <w:r>
+        <w:t>მნიშვნელოვანი</w:t>
+      </w:r>
+      <w:r>
+        <w:t xml:space="preserve"> </w:t>
+      </w:r>
+      <w:r>
+        <w:t>ტექნიკური</w:t>
+      </w:r>
+      <w:r>
+        <w:t xml:space="preserve"> </w:t>
+      </w:r>
+      <w:r>
+        <w:t>გადაწყვეტილებები</w:t>
+      </w:r>
+    </w:p>
+    <w:bookmarkEnd w:id="0"/>
+    <w:p>
+      <w:pPr>
+        <w:pStyle w:val="NormalWeb"/>
+      </w:pPr>
+      <w:r>
+        <w:rPr>
+          <w:rFonts w:ascii="Sylfaen" w:hAnsi="Sylfaen" w:cs="Sylfaen"/>
+        </w:rPr>
+        <w:t>პროექტის</w:t>
+      </w:r>
+      <w:r>
+        <w:t xml:space="preserve"> </w:t>
+      </w:r>
+      <w:r>
+        <w:rPr>
+          <w:rFonts w:ascii="Sylfaen" w:hAnsi="Sylfaen" w:cs="Sylfaen"/>
+        </w:rPr>
+        <w:t>განვითარებისას</w:t>
+      </w:r>
+      <w:r>
+        <w:t xml:space="preserve"> </w:t>
+      </w:r>
+      <w:r>
+        <w:rPr>
+          <w:rFonts w:ascii="Sylfaen" w:hAnsi="Sylfaen" w:cs="Sylfaen"/>
+        </w:rPr>
+        <w:t>მიღებული</w:t>
+      </w:r>
+      <w:r>
+        <w:t xml:space="preserve"> </w:t>
+      </w:r>
+      <w:r>
+        <w:rPr>
+          <w:rFonts w:ascii="Sylfaen" w:hAnsi="Sylfaen" w:cs="Sylfaen"/>
+        </w:rPr>
+        <w:t>იქნა</w:t>
+      </w:r>
+      <w:r>
+        <w:t xml:space="preserve"> </w:t>
+      </w:r>
+      <w:r>
+        <w:rPr>
+          <w:rFonts w:ascii="Sylfaen" w:hAnsi="Sylfaen" w:cs="Sylfaen"/>
+        </w:rPr>
+        <w:t>რამდენიმე</w:t>
+      </w:r>
+      <w:r>
+        <w:t xml:space="preserve"> </w:t>
+      </w:r>
+      <w:r>
+        <w:rPr>
+          <w:rFonts w:ascii="Sylfaen" w:hAnsi="Sylfaen" w:cs="Sylfaen"/>
+        </w:rPr>
+        <w:t>მნიშვნელოვანი</w:t>
+      </w:r>
+      <w:r>
+        <w:t xml:space="preserve"> </w:t>
+      </w:r>
+      <w:r>
+        <w:rPr>
+          <w:rFonts w:ascii="Sylfaen" w:hAnsi="Sylfaen" w:cs="Sylfaen"/>
+        </w:rPr>
+        <w:t>ტექნიკური</w:t>
+      </w:r>
+      <w:r>
+        <w:t xml:space="preserve"> </w:t>
+      </w:r>
+      <w:r>
+        <w:rPr>
+          <w:rFonts w:ascii="Sylfaen" w:hAnsi="Sylfaen" w:cs="Sylfaen"/>
+        </w:rPr>
+        <w:t>გადაწყვეტილება</w:t>
+      </w:r>
+      <w:r>
+        <w:t>.</w:t>
+      </w:r>
+    </w:p>
+    <w:p>
+      <w:pPr>
         <w:pStyle w:val="NormalWeb"/>
       </w:pPr>
       <w:r>
@@ -14016,6 +14053,176 @@
         <w:pStyle w:val="NormalWeb"/>
       </w:pPr>
       <w:r>
+        <w:t xml:space="preserve">Firebase Authentication </w:t>
+      </w:r>
+      <w:r>
+        <w:rPr>
+          <w:rFonts w:ascii="Sylfaen" w:hAnsi="Sylfaen" w:cs="Sylfaen"/>
+        </w:rPr>
+        <w:t>ასევე</w:t>
+      </w:r>
+      <w:r>
+        <w:t xml:space="preserve"> </w:t>
+      </w:r>
+      <w:r>
+        <w:rPr>
+          <w:rFonts w:ascii="Sylfaen" w:hAnsi="Sylfaen" w:cs="Sylfaen"/>
+        </w:rPr>
+        <w:t>გამოიყენება</w:t>
+      </w:r>
+      <w:r>
+        <w:t xml:space="preserve"> </w:t>
+      </w:r>
+      <w:r>
+        <w:rPr>
+          <w:rFonts w:ascii="Sylfaen" w:hAnsi="Sylfaen" w:cs="Sylfaen"/>
+        </w:rPr>
+        <w:t>პაროლის</w:t>
+      </w:r>
+      <w:r>
+        <w:t xml:space="preserve"> </w:t>
+      </w:r>
+      <w:r>
+        <w:rPr>
+          <w:rFonts w:ascii="Sylfaen" w:hAnsi="Sylfaen" w:cs="Sylfaen"/>
+        </w:rPr>
+        <w:t>აღდგენის</w:t>
+      </w:r>
+      <w:r>
+        <w:t xml:space="preserve"> (Forgot Password) </w:t>
+      </w:r>
+      <w:r>
+        <w:rPr>
+          <w:rFonts w:ascii="Sylfaen" w:hAnsi="Sylfaen" w:cs="Sylfaen"/>
+        </w:rPr>
+        <w:t>ფუნქციონალის</w:t>
+      </w:r>
+      <w:r>
+        <w:t xml:space="preserve"> </w:t>
+      </w:r>
+      <w:r>
+        <w:rPr>
+          <w:rFonts w:ascii="Sylfaen" w:hAnsi="Sylfaen" w:cs="Sylfaen"/>
+        </w:rPr>
+        <w:t>უზრუნველსაყოფად</w:t>
+      </w:r>
+      <w:r>
+        <w:t xml:space="preserve">, </w:t>
+      </w:r>
+      <w:r>
+        <w:rPr>
+          <w:rFonts w:ascii="Sylfaen" w:hAnsi="Sylfaen" w:cs="Sylfaen"/>
+        </w:rPr>
+        <w:t>რაც</w:t>
+      </w:r>
+      <w:r>
+        <w:t xml:space="preserve"> </w:t>
+      </w:r>
+      <w:r>
+        <w:rPr>
+          <w:rFonts w:ascii="Sylfaen" w:hAnsi="Sylfaen" w:cs="Sylfaen"/>
+        </w:rPr>
+        <w:t>მომხმარებლებს</w:t>
+      </w:r>
+      <w:r>
+        <w:t xml:space="preserve"> </w:t>
+      </w:r>
+      <w:r>
+        <w:rPr>
+          <w:rFonts w:ascii="Sylfaen" w:hAnsi="Sylfaen" w:cs="Sylfaen"/>
+        </w:rPr>
+        <w:t>საშუალებას</w:t>
+      </w:r>
+      <w:r>
+        <w:t xml:space="preserve"> </w:t>
+      </w:r>
+      <w:r>
+        <w:rPr>
+          <w:rFonts w:ascii="Sylfaen" w:hAnsi="Sylfaen" w:cs="Sylfaen"/>
+        </w:rPr>
+        <w:t>აძლევს</w:t>
+      </w:r>
+      <w:r>
+        <w:t xml:space="preserve"> </w:t>
+      </w:r>
+      <w:r>
+        <w:rPr>
+          <w:rFonts w:ascii="Sylfaen" w:hAnsi="Sylfaen" w:cs="Sylfaen"/>
+        </w:rPr>
+        <w:t>დამოუკიდებლად</w:t>
+      </w:r>
+      <w:r>
+        <w:t xml:space="preserve"> </w:t>
+      </w:r>
+      <w:r>
+        <w:rPr>
+          <w:rFonts w:ascii="Sylfaen" w:hAnsi="Sylfaen" w:cs="Sylfaen"/>
+        </w:rPr>
+        <w:t>აღადგინონ</w:t>
+      </w:r>
+      <w:r>
+        <w:t xml:space="preserve"> </w:t>
+      </w:r>
+      <w:r>
+        <w:rPr>
+          <w:rFonts w:ascii="Sylfaen" w:hAnsi="Sylfaen" w:cs="Sylfaen"/>
+        </w:rPr>
+        <w:t>საკუთარი</w:t>
+      </w:r>
+      <w:r>
+        <w:t xml:space="preserve"> </w:t>
+      </w:r>
+      <w:r>
+        <w:rPr>
+          <w:rFonts w:ascii="Sylfaen" w:hAnsi="Sylfaen" w:cs="Sylfaen"/>
+        </w:rPr>
+        <w:t>ანგარიშის</w:t>
+      </w:r>
+      <w:r>
+        <w:t xml:space="preserve"> </w:t>
+      </w:r>
+      <w:r>
+        <w:rPr>
+          <w:rFonts w:ascii="Sylfaen" w:hAnsi="Sylfaen" w:cs="Sylfaen"/>
+        </w:rPr>
+        <w:t>პაროლი</w:t>
+      </w:r>
+      <w:r>
+        <w:t xml:space="preserve"> </w:t>
+      </w:r>
+      <w:r>
+        <w:rPr>
+          <w:rFonts w:ascii="Sylfaen" w:hAnsi="Sylfaen" w:cs="Sylfaen"/>
+        </w:rPr>
+        <w:t>ელექტრონული</w:t>
+      </w:r>
+      <w:r>
+        <w:t xml:space="preserve"> </w:t>
+      </w:r>
+      <w:r>
+        <w:rPr>
+          <w:rFonts w:ascii="Sylfaen" w:hAnsi="Sylfaen" w:cs="Sylfaen"/>
+        </w:rPr>
+        <w:t>ფოსტის</w:t>
+      </w:r>
+      <w:r>
+        <w:t xml:space="preserve"> </w:t>
+      </w:r>
+      <w:r>
+        <w:rPr>
+          <w:rFonts w:ascii="Sylfaen" w:hAnsi="Sylfaen" w:cs="Sylfaen"/>
+        </w:rPr>
+        <w:t>საშუალებით</w:t>
+      </w:r>
+      <w:r>
+        <w:t>.</w:t>
+      </w:r>
+    </w:p>
+    <w:p>
+      <w:pPr>
+        <w:pStyle w:val="NormalWeb"/>
+      </w:pPr>
+      <w:r>
         <w:rPr>
           <w:rStyle w:val="Strong"/>
           <w:rFonts w:eastAsiaTheme="majorEastAsia"/>
@@ -14388,6 +14595,7 @@
         <w:rPr>
           <w:rFonts w:ascii="Sylfaen" w:hAnsi="Sylfaen" w:cs="Sylfaen"/>
         </w:rPr>
+        <w:lastRenderedPageBreak/>
         <w:t>აპლიკაცია</w:t>
       </w:r>
       <w:r>
@@ -14693,7 +14901,7 @@
     <w:p>
       <w:r>
         <w:pict w14:anchorId="5CBC9A72">
-          <v:rect id="_x0000_i1142" style="width:0;height:1.5pt" o:hralign="center" o:hrstd="t" o:hr="t" fillcolor="#a0a0a0" stroked="f"/>
+          <v:rect id="_x0000_i1035" style="width:0;height:1.5pt" o:hralign="center" o:hrstd="t" o:hr="t" fillcolor="#a0a0a0" stroked="f"/>
         </w:pict>
       </w:r>
     </w:p>
@@ -14701,9 +14909,14 @@
       <w:pPr>
         <w:pStyle w:val="Heading2"/>
       </w:pPr>
-      <w:bookmarkStart w:id="0" w:name="_GoBack"/>
-      <w:r>
-        <w:t xml:space="preserve">5.4 </w:t>
+      <w:r>
+        <w:t>5.</w:t>
+      </w:r>
+      <w:r>
+        <w:t>6</w:t>
+      </w:r>
+      <w:r>
+        <w:t xml:space="preserve"> </w:t>
       </w:r>
       <w:r>
         <w:t>განხორციელებული</w:t>
@@ -14727,7 +14940,6 @@
         <w:t>ეტაპზე</w:t>
       </w:r>
     </w:p>
-    <w:bookmarkEnd w:id="0"/>
     <w:p>
       <w:pPr>
         <w:pStyle w:val="NormalWeb"/>
@@ -14862,7 +15074,12 @@
         <w:spacing w:before="100" w:beforeAutospacing="1" w:after="100" w:afterAutospacing="1" w:line="240" w:lineRule="auto"/>
       </w:pPr>
       <w:r>
-        <w:t xml:space="preserve">მომხმარებლის მონაცემების ვალიდაცია; </w:t>
+        <w:t>მომხმარებლის მონაცემების ვალი</w:t>
+      </w:r>
+      <w:bookmarkStart w:id="1" w:name="_GoBack"/>
+      <w:bookmarkEnd w:id="1"/>
+      <w:r>
+        <w:t xml:space="preserve">დაცია; </w:t>
       </w:r>
     </w:p>
     <w:p>
@@ -14900,6 +15117,122 @@
       <w:r>
         <w:t>დაცული გვერდების შექმნა Protected Route-ის საშუალებით.</w:t>
       </w:r>
+    </w:p>
+    <w:p>
+      <w:pPr>
+        <w:numPr>
+          <w:ilvl w:val="0"/>
+          <w:numId w:val="19"/>
+        </w:numPr>
+        <w:spacing w:before="100" w:beforeAutospacing="1" w:after="100" w:afterAutospacing="1" w:line="240" w:lineRule="auto"/>
+        <w:rPr>
+          <w:rFonts w:ascii="Times New Roman" w:eastAsia="Times New Roman" w:hAnsi="Times New Roman" w:cs="Times New Roman"/>
+          <w:sz w:val="24"/>
+          <w:szCs w:val="24"/>
+        </w:rPr>
+      </w:pPr>
+      <w:r>
+        <w:rPr>
+          <w:rFonts w:ascii="Sylfaen" w:eastAsia="Times New Roman" w:hAnsi="Sylfaen" w:cs="Sylfaen"/>
+          <w:sz w:val="24"/>
+          <w:szCs w:val="24"/>
+        </w:rPr>
+        <w:t>პაროლის</w:t>
+      </w:r>
+      <w:r>
+        <w:rPr>
+          <w:rFonts w:ascii="Times New Roman" w:eastAsia="Times New Roman" w:hAnsi="Times New Roman" w:cs="Times New Roman"/>
+          <w:sz w:val="24"/>
+          <w:szCs w:val="24"/>
+        </w:rPr>
+        <w:t xml:space="preserve"> </w:t>
+      </w:r>
+      <w:r>
+        <w:rPr>
+          <w:rFonts w:ascii="Sylfaen" w:eastAsia="Times New Roman" w:hAnsi="Sylfaen" w:cs="Sylfaen"/>
+          <w:sz w:val="24"/>
+          <w:szCs w:val="24"/>
+        </w:rPr>
+        <w:t>აღდგენის</w:t>
+      </w:r>
+      <w:r>
+        <w:rPr>
+          <w:rFonts w:ascii="Times New Roman" w:eastAsia="Times New Roman" w:hAnsi="Times New Roman" w:cs="Times New Roman"/>
+          <w:sz w:val="24"/>
+          <w:szCs w:val="24"/>
+        </w:rPr>
+        <w:t xml:space="preserve"> (Forgot Password) </w:t>
+      </w:r>
+      <w:r>
+        <w:rPr>
+          <w:rFonts w:ascii="Sylfaen" w:eastAsia="Times New Roman" w:hAnsi="Sylfaen" w:cs="Sylfaen"/>
+          <w:sz w:val="24"/>
+          <w:szCs w:val="24"/>
+        </w:rPr>
+        <w:t>ფუნქციის</w:t>
+      </w:r>
+      <w:r>
+        <w:rPr>
+          <w:rFonts w:ascii="Times New Roman" w:eastAsia="Times New Roman" w:hAnsi="Times New Roman" w:cs="Times New Roman"/>
+          <w:sz w:val="24"/>
+          <w:szCs w:val="24"/>
+        </w:rPr>
+        <w:t xml:space="preserve"> </w:t>
+      </w:r>
+      <w:r>
+        <w:rPr>
+          <w:rFonts w:ascii="Sylfaen" w:eastAsia="Times New Roman" w:hAnsi="Sylfaen" w:cs="Sylfaen"/>
+          <w:sz w:val="24"/>
+          <w:szCs w:val="24"/>
+        </w:rPr>
+        <w:t>დამატება</w:t>
+      </w:r>
+      <w:r>
+        <w:rPr>
+          <w:rFonts w:ascii="Times New Roman" w:eastAsia="Times New Roman" w:hAnsi="Times New Roman" w:cs="Times New Roman"/>
+          <w:sz w:val="24"/>
+          <w:szCs w:val="24"/>
+        </w:rPr>
+        <w:t xml:space="preserve"> Firebase Authentication-</w:t>
+      </w:r>
+      <w:r>
+        <w:rPr>
+          <w:rFonts w:ascii="Sylfaen" w:eastAsia="Times New Roman" w:hAnsi="Sylfaen" w:cs="Sylfaen"/>
+          <w:sz w:val="24"/>
+          <w:szCs w:val="24"/>
+        </w:rPr>
+        <w:t>ის</w:t>
+      </w:r>
+      <w:r>
+        <w:rPr>
+          <w:rFonts w:ascii="Times New Roman" w:eastAsia="Times New Roman" w:hAnsi="Times New Roman" w:cs="Times New Roman"/>
+          <w:sz w:val="24"/>
+          <w:szCs w:val="24"/>
+        </w:rPr>
+        <w:t xml:space="preserve"> </w:t>
+      </w:r>
+      <w:r>
+        <w:rPr>
+          <w:rFonts w:ascii="Sylfaen" w:eastAsia="Times New Roman" w:hAnsi="Sylfaen" w:cs="Sylfaen"/>
+          <w:sz w:val="24"/>
+          <w:szCs w:val="24"/>
+        </w:rPr>
+        <w:t>გამოყენებით</w:t>
+      </w:r>
+      <w:r>
+        <w:rPr>
+          <w:rFonts w:ascii="Times New Roman" w:eastAsia="Times New Roman" w:hAnsi="Times New Roman" w:cs="Times New Roman"/>
+          <w:sz w:val="24"/>
+          <w:szCs w:val="24"/>
+        </w:rPr>
+        <w:t xml:space="preserve">; </w:t>
+      </w:r>
+    </w:p>
+    <w:p>
+      <w:pPr>
+        <w:spacing w:before="100" w:beforeAutospacing="1" w:after="100" w:afterAutospacing="1" w:line="240" w:lineRule="auto"/>
+        <w:ind w:left="720"/>
+      </w:pPr>
     </w:p>
     <w:p>
       <w:pPr>
@@ -17273,9 +17606,9 @@
     </w:lvl>
   </w:abstractNum>
   <w:abstractNum w:abstractNumId="17" w15:restartNumberingAfterBreak="0">
-    <w:nsid w:val="7AB13D5C"/>
+    <w:nsid w:val="6D233670"/>
     <w:multiLevelType w:val="multilevel"/>
-    <w:tmpl w:val="538A6222"/>
+    <w:tmpl w:val="2C82CDB2"/>
     <w:lvl w:ilvl="0">
       <w:start w:val="1"/>
       <w:numFmt w:val="bullet"/>
@@ -17422,6 +17755,155 @@
     </w:lvl>
   </w:abstractNum>
   <w:abstractNum w:abstractNumId="18" w15:restartNumberingAfterBreak="0">
+    <w:nsid w:val="7AB13D5C"/>
+    <w:multiLevelType w:val="multilevel"/>
+    <w:tmpl w:val="538A6222"/>
+    <w:lvl w:ilvl="0">
+      <w:start w:val="1"/>
+      <w:numFmt w:val="bullet"/>
+      <w:lvlText w:val=""/>
+      <w:lvlJc w:val="left"/>
+      <w:pPr>
+        <w:tabs>
+          <w:tab w:val="num" w:pos="720"/>
+        </w:tabs>
+        <w:ind w:left="720" w:hanging="360"/>
+      </w:pPr>
+      <w:rPr>
+        <w:rFonts w:ascii="Symbol" w:hAnsi="Symbol" w:hint="default"/>
+        <w:sz w:val="20"/>
+      </w:rPr>
+    </w:lvl>
+    <w:lvl w:ilvl="1" w:tentative="1">
+      <w:start w:val="1"/>
+      <w:numFmt w:val="bullet"/>
+      <w:lvlText w:val="o"/>
+      <w:lvlJc w:val="left"/>
+      <w:pPr>
+        <w:tabs>
+          <w:tab w:val="num" w:pos="1440"/>
+        </w:tabs>
+        <w:ind w:left="1440" w:hanging="360"/>
+      </w:pPr>
+      <w:rPr>
+        <w:rFonts w:ascii="Courier New" w:hAnsi="Courier New" w:hint="default"/>
+        <w:sz w:val="20"/>
+      </w:rPr>
+    </w:lvl>
+    <w:lvl w:ilvl="2" w:tentative="1">
+      <w:start w:val="1"/>
+      <w:numFmt w:val="bullet"/>
+      <w:lvlText w:val=""/>
+      <w:lvlJc w:val="left"/>
+      <w:pPr>
+        <w:tabs>
+          <w:tab w:val="num" w:pos="2160"/>
+        </w:tabs>
+        <w:ind w:left="2160" w:hanging="360"/>
+      </w:pPr>
+      <w:rPr>
+        <w:rFonts w:ascii="Wingdings" w:hAnsi="Wingdings" w:hint="default"/>
+        <w:sz w:val="20"/>
+      </w:rPr>
+    </w:lvl>
+    <w:lvl w:ilvl="3" w:tentative="1">
+      <w:start w:val="1"/>
+      <w:numFmt w:val="bullet"/>
+      <w:lvlText w:val=""/>
+      <w:lvlJc w:val="left"/>
+      <w:pPr>
+        <w:tabs>
+          <w:tab w:val="num" w:pos="2880"/>
+        </w:tabs>
+        <w:ind w:left="2880" w:hanging="360"/>
+      </w:pPr>
+      <w:rPr>
+        <w:rFonts w:ascii="Wingdings" w:hAnsi="Wingdings" w:hint="default"/>
+        <w:sz w:val="20"/>
+      </w:rPr>
+    </w:lvl>
+    <w:lvl w:ilvl="4" w:tentative="1">
+      <w:start w:val="1"/>
+      <w:numFmt w:val="bullet"/>
+      <w:lvlText w:val=""/>
+      <w:lvlJc w:val="left"/>
+      <w:pPr>
+        <w:tabs>
+          <w:tab w:val="num" w:pos="3600"/>
+        </w:tabs>
+        <w:ind w:left="3600" w:hanging="360"/>
+      </w:pPr>
+      <w:rPr>
+        <w:rFonts w:ascii="Wingdings" w:hAnsi="Wingdings" w:hint="default"/>
+        <w:sz w:val="20"/>
+      </w:rPr>
+    </w:lvl>
+    <w:lvl w:ilvl="5" w:tentative="1">
+      <w:start w:val="1"/>
+      <w:numFmt w:val="bullet"/>
+      <w:lvlText w:val=""/>
+      <w:lvlJc w:val="left"/>
+      <w:pPr>
+        <w:tabs>
+          <w:tab w:val="num" w:pos="4320"/>
+        </w:tabs>
+        <w:ind w:left="4320" w:hanging="360"/>
+      </w:pPr>
+      <w:rPr>
+        <w:rFonts w:ascii="Wingdings" w:hAnsi="Wingdings" w:hint="default"/>
+        <w:sz w:val="20"/>
+      </w:rPr>
+    </w:lvl>
+    <w:lvl w:ilvl="6" w:tentative="1">
+      <w:start w:val="1"/>
+      <w:numFmt w:val="bullet"/>
+      <w:lvlText w:val=""/>
+      <w:lvlJc w:val="left"/>
+      <w:pPr>
+        <w:tabs>
+          <w:tab w:val="num" w:pos="5040"/>
+        </w:tabs>
+        <w:ind w:left="5040" w:hanging="360"/>
+      </w:pPr>
+      <w:rPr>
+        <w:rFonts w:ascii="Wingdings" w:hAnsi="Wingdings" w:hint="default"/>
+        <w:sz w:val="20"/>
+      </w:rPr>
+    </w:lvl>
+    <w:lvl w:ilvl="7" w:tentative="1">
+      <w:start w:val="1"/>
+      <w:numFmt w:val="bullet"/>
+      <w:lvlText w:val=""/>
+      <w:lvlJc w:val="left"/>
+      <w:pPr>
+        <w:tabs>
+          <w:tab w:val="num" w:pos="5760"/>
+        </w:tabs>
+        <w:ind w:left="5760" w:hanging="360"/>
+      </w:pPr>
+      <w:rPr>
+        <w:rFonts w:ascii="Wingdings" w:hAnsi="Wingdings" w:hint="default"/>
+        <w:sz w:val="20"/>
+      </w:rPr>
+    </w:lvl>
+    <w:lvl w:ilvl="8" w:tentative="1">
+      <w:start w:val="1"/>
+      <w:numFmt w:val="bullet"/>
+      <w:lvlText w:val=""/>
+      <w:lvlJc w:val="left"/>
+      <w:pPr>
+        <w:tabs>
+          <w:tab w:val="num" w:pos="6480"/>
+        </w:tabs>
+        <w:ind w:left="6480" w:hanging="360"/>
+      </w:pPr>
+      <w:rPr>
+        <w:rFonts w:ascii="Wingdings" w:hAnsi="Wingdings" w:hint="default"/>
+        <w:sz w:val="20"/>
+      </w:rPr>
+    </w:lvl>
+  </w:abstractNum>
+  <w:abstractNum w:abstractNumId="19" w15:restartNumberingAfterBreak="0">
     <w:nsid w:val="7F066E7E"/>
     <w:multiLevelType w:val="multilevel"/>
     <w:tmpl w:val="2D72F8FA"/>
@@ -17589,7 +18071,7 @@
     <w:abstractNumId w:val="0"/>
   </w:num>
   <w:num w:numId="7">
-    <w:abstractNumId w:val="17"/>
+    <w:abstractNumId w:val="18"/>
   </w:num>
   <w:num w:numId="8">
     <w:abstractNumId w:val="9"/>
@@ -17610,7 +18092,7 @@
     <w:abstractNumId w:val="10"/>
   </w:num>
   <w:num w:numId="14">
-    <w:abstractNumId w:val="18"/>
+    <w:abstractNumId w:val="19"/>
   </w:num>
   <w:num w:numId="15">
     <w:abstractNumId w:val="15"/>
@@ -17626,6 +18108,9 @@
   </w:num>
   <w:num w:numId="19">
     <w:abstractNumId w:val="11"/>
+  </w:num>
+  <w:num w:numId="20">
+    <w:abstractNumId w:val="17"/>
   </w:num>
 </w:numbering>
 </file>

</xml_diff>